<commit_message>
Created active_test and baseline for case study; cleaned up inputs up to RE opex
</commit_message>
<xml_diff>
--- a/Case_Study/Hydrogen Case Study Background.docx
+++ b/Case_Study/Hydrogen Case Study Background.docx
@@ -1,6 +1,6 @@
 
 <file path=word/document.xml><?xml version="1.0" encoding="utf-8"?>
-<w:document xmlns:wpc="http://schemas.microsoft.com/office/word/2010/wordprocessingCanvas" xmlns:cx="http://schemas.microsoft.com/office/drawing/2014/chartex" xmlns:cx1="http://schemas.microsoft.com/office/drawing/2015/9/8/chartex" xmlns:cx2="http://schemas.microsoft.com/office/drawing/2015/10/21/chartex" xmlns:cx3="http://schemas.microsoft.com/office/drawing/2016/5/9/chartex" xmlns:cx4="http://schemas.microsoft.com/office/drawing/2016/5/10/chartex" xmlns:cx5="http://schemas.microsoft.com/office/drawing/2016/5/11/chartex" xmlns:cx6="http://schemas.microsoft.com/office/drawing/2016/5/12/chartex" xmlns:cx7="http://schemas.microsoft.com/office/drawing/2016/5/13/chartex" xmlns:cx8="http://schemas.microsoft.com/office/drawing/2016/5/14/chartex" xmlns:mc="http://schemas.openxmlformats.org/markup-compatibility/2006" xmlns:aink="http://schemas.microsoft.com/office/drawing/2016/ink" xmlns:am3d="http://schemas.microsoft.com/office/drawing/2017/model3d" xmlns:o="urn:schemas-microsoft-com:office:office" xmlns:oel="http://schemas.microsoft.com/office/2019/extlst" xmlns:r="http://schemas.openxmlformats.org/officeDocument/2006/relationships" xmlns:m="http://schemas.openxmlformats.org/officeDocument/2006/math" xmlns:v="urn:schemas-microsoft-com:vml" xmlns:wp14="http://schemas.microsoft.com/office/word/2010/wordprocessingDrawing" xmlns:wp="http://schemas.openxmlformats.org/drawingml/2006/wordprocessingDrawing" xmlns:w10="urn:schemas-microsoft-com:office:word" xmlns:w="http://schemas.openxmlformats.org/wordprocessingml/2006/main" xmlns:w14="http://schemas.microsoft.com/office/word/2010/wordml" xmlns:w15="http://schemas.microsoft.com/office/word/2012/wordml" xmlns:w16cex="http://schemas.microsoft.com/office/word/2018/wordml/cex" xmlns:w16cid="http://schemas.microsoft.com/office/word/2016/wordml/cid" xmlns:w16="http://schemas.microsoft.com/office/word/2018/wordml" xmlns:w16sdtdh="http://schemas.microsoft.com/office/word/2020/wordml/sdtdatahash" xmlns:w16se="http://schemas.microsoft.com/office/word/2015/wordml/symex" xmlns:wpg="http://schemas.microsoft.com/office/word/2010/wordprocessingGroup" xmlns:wpi="http://schemas.microsoft.com/office/word/2010/wordprocessingInk" xmlns:wne="http://schemas.microsoft.com/office/word/2006/wordml" xmlns:wps="http://schemas.microsoft.com/office/word/2010/wordprocessingShape" mc:Ignorable="w14 w15 w16se w16cid w16 w16cex w16sdtdh wp14">
+<w:document xmlns:wpc="http://schemas.microsoft.com/office/word/2010/wordprocessingCanvas" xmlns:cx="http://schemas.microsoft.com/office/drawing/2014/chartex" xmlns:cx1="http://schemas.microsoft.com/office/drawing/2015/9/8/chartex" xmlns:cx2="http://schemas.microsoft.com/office/drawing/2015/10/21/chartex" xmlns:cx3="http://schemas.microsoft.com/office/drawing/2016/5/9/chartex" xmlns:cx4="http://schemas.microsoft.com/office/drawing/2016/5/10/chartex" xmlns:cx5="http://schemas.microsoft.com/office/drawing/2016/5/11/chartex" xmlns:cx6="http://schemas.microsoft.com/office/drawing/2016/5/12/chartex" xmlns:cx7="http://schemas.microsoft.com/office/drawing/2016/5/13/chartex" xmlns:cx8="http://schemas.microsoft.com/office/drawing/2016/5/14/chartex" xmlns:mc="http://schemas.openxmlformats.org/markup-compatibility/2006" xmlns:aink="http://schemas.microsoft.com/office/drawing/2016/ink" xmlns:am3d="http://schemas.microsoft.com/office/drawing/2017/model3d" xmlns:o="urn:schemas-microsoft-com:office:office" xmlns:oel="http://schemas.microsoft.com/office/2019/extlst" xmlns:r="http://schemas.openxmlformats.org/officeDocument/2006/relationships" xmlns:m="http://schemas.openxmlformats.org/officeDocument/2006/math" xmlns:v="urn:schemas-microsoft-com:vml" xmlns:wp14="http://schemas.microsoft.com/office/word/2010/wordprocessingDrawing" xmlns:wp="http://schemas.openxmlformats.org/drawingml/2006/wordprocessingDrawing" xmlns:w10="urn:schemas-microsoft-com:office:word" xmlns:w="http://schemas.openxmlformats.org/wordprocessingml/2006/main" xmlns:w14="http://schemas.microsoft.com/office/word/2010/wordml" xmlns:w15="http://schemas.microsoft.com/office/word/2012/wordml" xmlns:w16cex="http://schemas.microsoft.com/office/word/2018/wordml/cex" xmlns:w16cid="http://schemas.microsoft.com/office/word/2016/wordml/cid" xmlns:w16="http://schemas.microsoft.com/office/word/2018/wordml" xmlns:w16du="http://schemas.microsoft.com/office/word/2023/wordml/word16du" xmlns:w16sdtdh="http://schemas.microsoft.com/office/word/2020/wordml/sdtdatahash" xmlns:w16se="http://schemas.microsoft.com/office/word/2015/wordml/symex" xmlns:wpg="http://schemas.microsoft.com/office/word/2010/wordprocessingGroup" xmlns:wpi="http://schemas.microsoft.com/office/word/2010/wordprocessingInk" xmlns:wne="http://schemas.microsoft.com/office/word/2006/wordml" xmlns:wps="http://schemas.microsoft.com/office/word/2010/wordprocessingShape" mc:Ignorable="w14 w15 w16se w16cid w16 w16cex w16sdtdh w16du wp14">
   <w:body>
     <w:p>
       <w:pPr>
@@ -60,14 +60,7 @@
           <w:b/>
           <w:bCs/>
         </w:rPr>
-        <w:t>Case Design</w:t>
-      </w:r>
-      <w:r>
-        <w:rPr>
-          <w:b/>
-          <w:bCs/>
-        </w:rPr>
-        <w:t>:</w:t>
+        <w:t>Case Design:</w:t>
       </w:r>
     </w:p>
     <w:p/>
@@ -1949,31 +1942,7 @@
                 <w:szCs w:val="20"/>
                 <w14:ligatures w14:val="none"/>
               </w:rPr>
-              <w:t xml:space="preserve">YES (20 </w:t>
-            </w:r>
-            <w:proofErr w:type="spellStart"/>
-            <w:r>
-              <w:rPr>
-                <w:rFonts w:eastAsia="Times New Roman" w:cs="Times New Roman"/>
-                <w:color w:val="000000"/>
-                <w:kern w:val="0"/>
-                <w:sz w:val="20"/>
-                <w:szCs w:val="20"/>
-                <w14:ligatures w14:val="none"/>
-              </w:rPr>
-              <w:t>kT</w:t>
-            </w:r>
-            <w:proofErr w:type="spellEnd"/>
-            <w:r>
-              <w:rPr>
-                <w:rFonts w:eastAsia="Times New Roman" w:cs="Times New Roman"/>
-                <w:color w:val="000000"/>
-                <w:kern w:val="0"/>
-                <w:sz w:val="20"/>
-                <w:szCs w:val="20"/>
-                <w14:ligatures w14:val="none"/>
-              </w:rPr>
-              <w:t>)</w:t>
+              <w:t>YES (20 kT)</w:t>
             </w:r>
           </w:p>
         </w:tc>
@@ -2072,31 +2041,7 @@
                 <w:szCs w:val="20"/>
                 <w14:ligatures w14:val="none"/>
               </w:rPr>
-              <w:t xml:space="preserve">Suburb, </w:t>
-            </w:r>
-            <w:proofErr w:type="spellStart"/>
-            <w:r>
-              <w:rPr>
-                <w:rFonts w:eastAsia="Times New Roman" w:cs="Times New Roman"/>
-                <w:color w:val="000000"/>
-                <w:kern w:val="0"/>
-                <w:sz w:val="20"/>
-                <w:szCs w:val="20"/>
-                <w14:ligatures w14:val="none"/>
-              </w:rPr>
-              <w:t>peaker</w:t>
-            </w:r>
-            <w:proofErr w:type="spellEnd"/>
-            <w:r>
-              <w:rPr>
-                <w:rFonts w:eastAsia="Times New Roman" w:cs="Times New Roman"/>
-                <w:color w:val="000000"/>
-                <w:kern w:val="0"/>
-                <w:sz w:val="20"/>
-                <w:szCs w:val="20"/>
-                <w14:ligatures w14:val="none"/>
-              </w:rPr>
-              <w:t xml:space="preserve"> plant</w:t>
+              <w:t>Suburb, peaker plant</w:t>
             </w:r>
           </w:p>
         </w:tc>
@@ -2792,6 +2737,9 @@
         <w:jc w:val="center"/>
       </w:pPr>
       <w:r>
+        <w:rPr>
+          <w:noProof/>
+        </w:rPr>
         <w:lastRenderedPageBreak/>
         <w:drawing>
           <wp:inline distT="0" distB="0" distL="0" distR="0" wp14:anchorId="62F3EDAC" wp14:editId="5B054D7E">
@@ -2854,15 +2802,7 @@
     </w:p>
     <w:p>
       <w:r>
-        <w:t xml:space="preserve">Node D (Inland): With small demand primarily for heavy-duty fuel cell electric vehicles (HD FCEVs), this node has poor onshore wind but good solar potential. It connects to the wholesale grid at a higher capacity and has significant geologic storage (20 </w:t>
-      </w:r>
-      <w:proofErr w:type="spellStart"/>
-      <w:r>
-        <w:t>kT</w:t>
-      </w:r>
-      <w:proofErr w:type="spellEnd"/>
-      <w:r>
-        <w:t>) alongside tank storage.</w:t>
+        <w:t>Node D (Inland): With small demand primarily for heavy-duty fuel cell electric vehicles (HD FCEVs), this node has poor onshore wind but good solar potential. It connects to the wholesale grid at a higher capacity and has significant geologic storage (20 kT) alongside tank storage.</w:t>
       </w:r>
     </w:p>
     <w:p>
@@ -3158,15 +3098,7 @@
           </w:tcPr>
           <w:p>
             <w:r>
-              <w:t>NREL Cambium (Mid-case) for US national in hourly resolution (</w:t>
-            </w:r>
-            <w:proofErr w:type="spellStart"/>
-            <w:r>
-              <w:t>total_cost_enduse</w:t>
-            </w:r>
-            <w:proofErr w:type="spellEnd"/>
-            <w:r>
-              <w:t>)</w:t>
+              <w:t>NREL Cambium (Mid-case) for US national in hourly resolution (total_cost_enduse)</w:t>
             </w:r>
           </w:p>
         </w:tc>
@@ -3195,13 +3127,8 @@
           </w:tcPr>
           <w:p>
             <w:r>
-              <w:t xml:space="preserve">PEM </w:t>
-            </w:r>
-            <w:proofErr w:type="spellStart"/>
-            <w:r>
-              <w:t>Electrolyzer</w:t>
-            </w:r>
-            <w:proofErr w:type="spellEnd"/>
+              <w:t>PEM Electrolyzer</w:t>
+            </w:r>
           </w:p>
         </w:tc>
         <w:tc>
@@ -3253,15 +3180,7 @@
           </w:tcPr>
           <w:p>
             <w:r>
-              <w:t xml:space="preserve">US number </w:t>
-            </w:r>
-            <w:proofErr w:type="gramStart"/>
-            <w:r>
-              <w:t>similar to</w:t>
-            </w:r>
-            <w:proofErr w:type="gramEnd"/>
-            <w:r>
-              <w:t xml:space="preserve"> NYSERDA, reference check with Jesse</w:t>
+              <w:t>US number similar to NYSERDA, reference check with Jesse</w:t>
             </w:r>
           </w:p>
         </w:tc>
@@ -3302,15 +3221,7 @@
           </w:tcPr>
           <w:p>
             <w:r>
-              <w:t xml:space="preserve">US number </w:t>
-            </w:r>
-            <w:proofErr w:type="gramStart"/>
-            <w:r>
-              <w:t>similar to</w:t>
-            </w:r>
-            <w:proofErr w:type="gramEnd"/>
-            <w:r>
-              <w:t xml:space="preserve"> NYSERDA, reference check with Jesse</w:t>
+              <w:t>US number similar to NYSERDA, reference check with Jesse</w:t>
             </w:r>
           </w:p>
         </w:tc>
@@ -3351,15 +3262,7 @@
           </w:tcPr>
           <w:p>
             <w:r>
-              <w:t xml:space="preserve">US number </w:t>
-            </w:r>
-            <w:proofErr w:type="gramStart"/>
-            <w:r>
-              <w:t>similar to</w:t>
-            </w:r>
-            <w:proofErr w:type="gramEnd"/>
-            <w:r>
-              <w:t xml:space="preserve"> NYSERDA, reference check with Jesse</w:t>
+              <w:t>US number similar to NYSERDA, reference check with Jesse</w:t>
             </w:r>
           </w:p>
         </w:tc>
@@ -3400,15 +3303,7 @@
           </w:tcPr>
           <w:p>
             <w:r>
-              <w:t xml:space="preserve">US number </w:t>
-            </w:r>
-            <w:proofErr w:type="gramStart"/>
-            <w:r>
-              <w:t>similar to</w:t>
-            </w:r>
-            <w:proofErr w:type="gramEnd"/>
-            <w:r>
-              <w:t xml:space="preserve"> NYSERDA, reference check with Jesse</w:t>
+              <w:t>US number similar to NYSERDA, reference check with Jesse</w:t>
             </w:r>
           </w:p>
         </w:tc>
@@ -3422,15 +3317,7 @@
     </w:p>
     <w:p>
       <w:r>
-        <w:t xml:space="preserve">H2 Production: Primarily relies on PEM (Proton Exchange Membrane) </w:t>
-      </w:r>
-      <w:proofErr w:type="spellStart"/>
-      <w:r>
-        <w:t>Electrolyzers</w:t>
-      </w:r>
-      <w:proofErr w:type="spellEnd"/>
-      <w:r>
-        <w:t xml:space="preserve"> to convert renewable energy into hydrogen.</w:t>
+        <w:t>H2 Production: Primarily relies on PEM (Proton Exchange Membrane) Electrolyzers to convert renewable energy into hydrogen.</w:t>
       </w:r>
     </w:p>
     <w:p>
@@ -3467,20 +3354,15 @@
     </w:p>
     <w:p>
       <w:r>
-        <w:t xml:space="preserve">The results of the case study </w:t>
-      </w:r>
-      <w:proofErr w:type="gramStart"/>
-      <w:r>
-        <w:t>is</w:t>
-      </w:r>
-      <w:proofErr w:type="gramEnd"/>
-      <w:r>
-        <w:t xml:space="preserve"> </w:t>
+        <w:t xml:space="preserve">The results of the case study is </w:t>
       </w:r>
     </w:p>
     <w:p>
       <w:r>
         <w:t>Hydrogen Cost</w:t>
+      </w:r>
+      <w:r>
+        <w:t xml:space="preserve"> (Total CAPEX, OPEX, levelized costs)</w:t>
       </w:r>
     </w:p>
     <w:p>
@@ -3493,10 +3375,18 @@
       <w:r>
         <w:t xml:space="preserve">Buildout map and capacity </w:t>
       </w:r>
+      <w:r>
+        <w:t xml:space="preserve"> (RE + electrolyzers)</w:t>
+      </w:r>
     </w:p>
     <w:p>
       <w:r>
         <w:t>Storage buildout and capacity</w:t>
+      </w:r>
+    </w:p>
+    <w:p>
+      <w:r>
+        <w:t>Operating dynamics for RE, electrolyzers, transmission, and storage</w:t>
       </w:r>
     </w:p>
     <w:sectPr>
@@ -3510,7 +3400,7 @@
 </file>
 
 <file path=word/styles.xml><?xml version="1.0" encoding="utf-8"?>
-<w:styles xmlns:mc="http://schemas.openxmlformats.org/markup-compatibility/2006" xmlns:r="http://schemas.openxmlformats.org/officeDocument/2006/relationships" xmlns:w="http://schemas.openxmlformats.org/wordprocessingml/2006/main" xmlns:w14="http://schemas.microsoft.com/office/word/2010/wordml" xmlns:w15="http://schemas.microsoft.com/office/word/2012/wordml" xmlns:w16cex="http://schemas.microsoft.com/office/word/2018/wordml/cex" xmlns:w16cid="http://schemas.microsoft.com/office/word/2016/wordml/cid" xmlns:w16="http://schemas.microsoft.com/office/word/2018/wordml" xmlns:w16sdtdh="http://schemas.microsoft.com/office/word/2020/wordml/sdtdatahash" xmlns:w16se="http://schemas.microsoft.com/office/word/2015/wordml/symex" mc:Ignorable="w14 w15 w16se w16cid w16 w16cex w16sdtdh">
+<w:styles xmlns:mc="http://schemas.openxmlformats.org/markup-compatibility/2006" xmlns:r="http://schemas.openxmlformats.org/officeDocument/2006/relationships" xmlns:w="http://schemas.openxmlformats.org/wordprocessingml/2006/main" xmlns:w14="http://schemas.microsoft.com/office/word/2010/wordml" xmlns:w15="http://schemas.microsoft.com/office/word/2012/wordml" xmlns:w16cex="http://schemas.microsoft.com/office/word/2018/wordml/cex" xmlns:w16cid="http://schemas.microsoft.com/office/word/2016/wordml/cid" xmlns:w16="http://schemas.microsoft.com/office/word/2018/wordml" xmlns:w16du="http://schemas.microsoft.com/office/word/2023/wordml/word16du" xmlns:w16sdtdh="http://schemas.microsoft.com/office/word/2020/wordml/sdtdatahash" xmlns:w16se="http://schemas.microsoft.com/office/word/2015/wordml/symex" mc:Ignorable="w14 w15 w16se w16cid w16 w16cex w16sdtdh w16du">
   <w:docDefaults>
     <w:rPrDefault>
       <w:rPr>
@@ -4111,6 +4001,7 @@
   <w:style w:type="character" w:default="1" w:styleId="DefaultParagraphFont">
     <w:name w:val="Default Paragraph Font"/>
     <w:uiPriority w:val="1"/>
+    <w:semiHidden/>
     <w:unhideWhenUsed/>
   </w:style>
   <w:style w:type="table" w:default="1" w:styleId="TableNormal">

</xml_diff>